<commit_message>
APuntes nueva clase. Inicio proyecto ML.
</commit_message>
<xml_diff>
--- a/DataMining_Parcial1.docx
+++ b/DataMining_Parcial1.docx
@@ -10401,10 +10401,1082 @@
     </w:p>
     <w:p>
       <w:pPr>
-        <w:rPr>
-          <w:lang w:val="es-EC"/>
-        </w:rPr>
-      </w:pPr>
+        <w:pStyle w:val="Heading1"/>
+        <w:rPr>
+          <w:lang w:val="es-EC"/>
+        </w:rPr>
+      </w:pPr>
+      <w:r>
+        <w:rPr>
+          <w:lang w:val="es-EC"/>
+        </w:rPr>
+        <w:t>Clase 25-02</w:t>
+      </w:r>
+    </w:p>
+    <w:p>
+      <w:pPr>
+        <w:pStyle w:val="ListParagraph"/>
+        <w:numPr>
+          <w:ilvl w:val="0"/>
+          <w:numId w:val="15"/>
+        </w:numPr>
+        <w:rPr>
+          <w:lang w:val="es-EC"/>
+        </w:rPr>
+      </w:pPr>
+      <w:proofErr w:type="spellStart"/>
+      <w:r>
+        <w:rPr>
+          <w:lang w:val="es-EC"/>
+        </w:rPr>
+        <w:t>Revision</w:t>
+      </w:r>
+      <w:proofErr w:type="spellEnd"/>
+      <w:r>
+        <w:rPr>
+          <w:lang w:val="es-EC"/>
+        </w:rPr>
+        <w:t xml:space="preserve"> arquitectura </w:t>
+      </w:r>
+      <w:proofErr w:type="spellStart"/>
+      <w:r>
+        <w:rPr>
+          <w:lang w:val="es-EC"/>
+        </w:rPr>
+        <w:t>spark</w:t>
+      </w:r>
+      <w:proofErr w:type="spellEnd"/>
+      <w:r>
+        <w:rPr>
+          <w:lang w:val="es-EC"/>
+        </w:rPr>
+        <w:t>.</w:t>
+      </w:r>
+    </w:p>
+    <w:p>
+      <w:pPr>
+        <w:rPr>
+          <w:lang w:val="es-EC"/>
+        </w:rPr>
+      </w:pPr>
+      <w:r>
+        <w:rPr>
+          <w:lang w:val="es-EC"/>
+        </w:rPr>
+        <w:t>Driver-</w:t>
+      </w:r>
+      <w:proofErr w:type="spellStart"/>
+      <w:proofErr w:type="gramStart"/>
+      <w:r>
+        <w:rPr>
+          <w:lang w:val="es-EC"/>
+        </w:rPr>
+        <w:t>cluster</w:t>
+      </w:r>
+      <w:proofErr w:type="spellEnd"/>
+      <w:proofErr w:type="gramEnd"/>
+      <w:r>
+        <w:rPr>
+          <w:lang w:val="es-EC"/>
+        </w:rPr>
+        <w:t xml:space="preserve"> </w:t>
+      </w:r>
+      <w:proofErr w:type="gramStart"/>
+      <w:r>
+        <w:rPr>
+          <w:lang w:val="es-EC"/>
+        </w:rPr>
+        <w:t>manager</w:t>
+      </w:r>
+      <w:proofErr w:type="gramEnd"/>
+      <w:r>
+        <w:rPr>
+          <w:lang w:val="es-EC"/>
+        </w:rPr>
+        <w:t>-</w:t>
+      </w:r>
+      <w:proofErr w:type="spellStart"/>
+      <w:r>
+        <w:rPr>
+          <w:lang w:val="es-EC"/>
+        </w:rPr>
+        <w:t>executors</w:t>
+      </w:r>
+      <w:proofErr w:type="spellEnd"/>
+    </w:p>
+    <w:p>
+      <w:pPr>
+        <w:pStyle w:val="ListParagraph"/>
+        <w:numPr>
+          <w:ilvl w:val="0"/>
+          <w:numId w:val="15"/>
+        </w:numPr>
+        <w:rPr>
+          <w:lang w:val="es-EC"/>
+        </w:rPr>
+      </w:pPr>
+      <w:r>
+        <w:rPr>
+          <w:lang w:val="es-EC"/>
+        </w:rPr>
+        <w:t>Ejemplo de Data: 100 GB de Sales y 1Gb de productos.</w:t>
+      </w:r>
+    </w:p>
+    <w:p>
+      <w:pPr>
+        <w:rPr>
+          <w:lang w:val="es-EC"/>
+        </w:rPr>
+      </w:pPr>
+      <w:r>
+        <w:rPr>
+          <w:lang w:val="es-EC"/>
+        </w:rPr>
+        <w:t xml:space="preserve">Tenemos 5 </w:t>
+      </w:r>
+      <w:proofErr w:type="spellStart"/>
+      <w:r>
+        <w:rPr>
+          <w:lang w:val="es-EC"/>
+        </w:rPr>
+        <w:t>clsuters</w:t>
+      </w:r>
+      <w:proofErr w:type="spellEnd"/>
+    </w:p>
+    <w:p>
+      <w:pPr>
+        <w:pStyle w:val="ListParagraph"/>
+        <w:numPr>
+          <w:ilvl w:val="0"/>
+          <w:numId w:val="1"/>
+        </w:numPr>
+        <w:rPr>
+          <w:lang w:val="es-EC"/>
+        </w:rPr>
+      </w:pPr>
+      <w:r>
+        <w:rPr>
+          <w:lang w:val="es-EC"/>
+        </w:rPr>
+        <w:t xml:space="preserve">Cuando cargamos: Spark-Read lo que sucede es que se divide la data en particiones de 20GB y 0.2 GB. Se divide la misma cantidad en cada uno. El defecto son 6 nodos. Estas divisiones son estocásticas, aleatorias. </w:t>
+      </w:r>
+    </w:p>
+    <w:p>
+      <w:pPr>
+        <w:pStyle w:val="ListParagraph"/>
+        <w:numPr>
+          <w:ilvl w:val="0"/>
+          <w:numId w:val="1"/>
+        </w:numPr>
+        <w:rPr>
+          <w:lang w:val="es-EC"/>
+        </w:rPr>
+      </w:pPr>
+      <w:proofErr w:type="spellStart"/>
+      <w:r>
+        <w:rPr>
+          <w:lang w:val="es-EC"/>
+        </w:rPr>
+        <w:t>Que</w:t>
+      </w:r>
+      <w:proofErr w:type="spellEnd"/>
+      <w:r>
+        <w:rPr>
+          <w:lang w:val="es-EC"/>
+        </w:rPr>
+        <w:t xml:space="preserve"> pasa si queremos hace run </w:t>
+      </w:r>
+      <w:proofErr w:type="spellStart"/>
+      <w:r>
+        <w:rPr>
+          <w:lang w:val="es-EC"/>
+        </w:rPr>
+        <w:t>fact_</w:t>
+      </w:r>
+      <w:proofErr w:type="gramStart"/>
+      <w:r>
+        <w:rPr>
+          <w:lang w:val="es-EC"/>
+        </w:rPr>
+        <w:t>sales.join</w:t>
+      </w:r>
+      <w:proofErr w:type="spellEnd"/>
+      <w:proofErr w:type="gramEnd"/>
+      <w:r>
+        <w:rPr>
+          <w:lang w:val="es-EC"/>
+        </w:rPr>
+        <w:t xml:space="preserve"> (</w:t>
+      </w:r>
+      <w:proofErr w:type="spellStart"/>
+      <w:r>
+        <w:rPr>
+          <w:lang w:val="es-EC"/>
+        </w:rPr>
+        <w:t>dim_product</w:t>
+      </w:r>
+      <w:proofErr w:type="spellEnd"/>
+      <w:r>
+        <w:rPr>
+          <w:lang w:val="es-EC"/>
+        </w:rPr>
+        <w:t xml:space="preserve">)? Si tenemos en 2 nodos puede que en un nodo el </w:t>
+      </w:r>
+      <w:proofErr w:type="spellStart"/>
+      <w:r>
+        <w:rPr>
+          <w:lang w:val="es-EC"/>
+        </w:rPr>
+        <w:t>p_id</w:t>
+      </w:r>
+      <w:proofErr w:type="spellEnd"/>
+      <w:r>
+        <w:rPr>
+          <w:lang w:val="es-EC"/>
+        </w:rPr>
+        <w:t xml:space="preserve"> tenga el valor 10 pero en </w:t>
+      </w:r>
+      <w:proofErr w:type="spellStart"/>
+      <w:r>
+        <w:rPr>
+          <w:lang w:val="es-EC"/>
+        </w:rPr>
+        <w:t>ningun</w:t>
+      </w:r>
+      <w:proofErr w:type="spellEnd"/>
+      <w:r>
+        <w:rPr>
+          <w:lang w:val="es-EC"/>
+        </w:rPr>
+        <w:t xml:space="preserve"> nodo </w:t>
+      </w:r>
+      <w:proofErr w:type="spellStart"/>
+      <w:r>
+        <w:rPr>
+          <w:lang w:val="es-EC"/>
+        </w:rPr>
+        <w:t>esta</w:t>
+      </w:r>
+      <w:proofErr w:type="spellEnd"/>
+      <w:r>
+        <w:rPr>
+          <w:lang w:val="es-EC"/>
+        </w:rPr>
+        <w:t xml:space="preserve"> el producto al que referencian.</w:t>
+      </w:r>
+    </w:p>
+    <w:p>
+      <w:pPr>
+        <w:pStyle w:val="ListParagraph"/>
+        <w:numPr>
+          <w:ilvl w:val="0"/>
+          <w:numId w:val="1"/>
+        </w:numPr>
+        <w:rPr>
+          <w:lang w:val="es-EC"/>
+        </w:rPr>
+      </w:pPr>
+      <w:r>
+        <w:rPr>
+          <w:lang w:val="es-EC"/>
+        </w:rPr>
+        <w:t xml:space="preserve">¿Cómo se soluciona? Spark maneja </w:t>
+      </w:r>
+      <w:proofErr w:type="gramStart"/>
+      <w:r>
+        <w:rPr>
+          <w:lang w:val="es-EC"/>
+        </w:rPr>
+        <w:t>un metada</w:t>
+      </w:r>
+      <w:proofErr w:type="gramEnd"/>
+      <w:r>
+        <w:rPr>
+          <w:lang w:val="es-EC"/>
+        </w:rPr>
+        <w:t xml:space="preserve"> </w:t>
+      </w:r>
+      <w:proofErr w:type="spellStart"/>
+      <w:r>
+        <w:rPr>
+          <w:lang w:val="es-EC"/>
+        </w:rPr>
+        <w:t>management</w:t>
+      </w:r>
+      <w:proofErr w:type="spellEnd"/>
+      <w:r>
+        <w:rPr>
+          <w:lang w:val="es-EC"/>
+        </w:rPr>
+        <w:t xml:space="preserve"> y sabe que esta que clave esta en que cosa. Esto </w:t>
+      </w:r>
+      <w:proofErr w:type="spellStart"/>
+      <w:r>
+        <w:rPr>
+          <w:lang w:val="es-EC"/>
+        </w:rPr>
+        <w:t>s</w:t>
+      </w:r>
+      <w:proofErr w:type="spellEnd"/>
+      <w:r>
+        <w:rPr>
+          <w:lang w:val="es-EC"/>
+        </w:rPr>
+        <w:t xml:space="preserve"> </w:t>
+      </w:r>
+      <w:proofErr w:type="spellStart"/>
+      <w:r>
+        <w:rPr>
+          <w:lang w:val="es-EC"/>
+        </w:rPr>
+        <w:t>eva</w:t>
+      </w:r>
+      <w:proofErr w:type="spellEnd"/>
+      <w:r>
+        <w:rPr>
+          <w:lang w:val="es-EC"/>
+        </w:rPr>
+        <w:t xml:space="preserve"> </w:t>
+      </w:r>
+      <w:proofErr w:type="spellStart"/>
+      <w:r>
+        <w:rPr>
+          <w:lang w:val="es-EC"/>
+        </w:rPr>
+        <w:t>calculadndo</w:t>
+      </w:r>
+      <w:proofErr w:type="spellEnd"/>
+      <w:r>
+        <w:rPr>
+          <w:lang w:val="es-EC"/>
+        </w:rPr>
+        <w:t xml:space="preserve"> </w:t>
+      </w:r>
+      <w:proofErr w:type="spellStart"/>
+      <w:r>
+        <w:rPr>
+          <w:lang w:val="es-EC"/>
+        </w:rPr>
+        <w:t>dinamicamiente</w:t>
+      </w:r>
+      <w:proofErr w:type="spellEnd"/>
+      <w:r>
+        <w:rPr>
+          <w:lang w:val="es-EC"/>
+        </w:rPr>
+        <w:t xml:space="preserve">. </w:t>
+      </w:r>
+      <w:proofErr w:type="spellStart"/>
+      <w:r>
+        <w:rPr>
+          <w:lang w:val="es-EC"/>
+        </w:rPr>
+        <w:t>Cuanod</w:t>
+      </w:r>
+      <w:proofErr w:type="spellEnd"/>
+      <w:r>
+        <w:rPr>
+          <w:lang w:val="es-EC"/>
+        </w:rPr>
+        <w:t xml:space="preserve"> se define la </w:t>
+      </w:r>
+      <w:proofErr w:type="spellStart"/>
+      <w:r>
+        <w:rPr>
+          <w:lang w:val="es-EC"/>
+        </w:rPr>
+        <w:t>joining</w:t>
+      </w:r>
+      <w:proofErr w:type="spellEnd"/>
+      <w:r>
+        <w:rPr>
+          <w:lang w:val="es-EC"/>
+        </w:rPr>
+        <w:t xml:space="preserve"> </w:t>
+      </w:r>
+      <w:proofErr w:type="spellStart"/>
+      <w:r>
+        <w:rPr>
+          <w:lang w:val="es-EC"/>
+        </w:rPr>
+        <w:t>key</w:t>
+      </w:r>
+      <w:proofErr w:type="spellEnd"/>
+      <w:r>
+        <w:rPr>
+          <w:lang w:val="es-EC"/>
+        </w:rPr>
+        <w:t xml:space="preserve"> se hace esta investigación. Cuando se define el </w:t>
+      </w:r>
+      <w:proofErr w:type="spellStart"/>
+      <w:r>
+        <w:rPr>
+          <w:lang w:val="es-EC"/>
+        </w:rPr>
+        <w:t>join</w:t>
+      </w:r>
+      <w:proofErr w:type="spellEnd"/>
+      <w:r>
+        <w:rPr>
+          <w:lang w:val="es-EC"/>
+        </w:rPr>
+        <w:t xml:space="preserve"> el motor va y busca. Ahí ocurre el </w:t>
+      </w:r>
+      <w:proofErr w:type="spellStart"/>
+      <w:r>
+        <w:rPr>
+          <w:lang w:val="es-EC"/>
+        </w:rPr>
+        <w:t>shuffle</w:t>
+      </w:r>
+      <w:proofErr w:type="spellEnd"/>
+      <w:r>
+        <w:rPr>
+          <w:lang w:val="es-EC"/>
+        </w:rPr>
+        <w:t>:</w:t>
+      </w:r>
+    </w:p>
+    <w:p>
+      <w:pPr>
+        <w:pStyle w:val="ListParagraph"/>
+        <w:numPr>
+          <w:ilvl w:val="0"/>
+          <w:numId w:val="1"/>
+        </w:numPr>
+        <w:rPr>
+          <w:lang w:val="es-EC"/>
+        </w:rPr>
+      </w:pPr>
+      <w:proofErr w:type="spellStart"/>
+      <w:r>
+        <w:rPr>
+          <w:lang w:val="es-EC"/>
+        </w:rPr>
+        <w:t>Shuffle</w:t>
+      </w:r>
+      <w:proofErr w:type="spellEnd"/>
+      <w:r>
+        <w:rPr>
+          <w:lang w:val="es-EC"/>
+        </w:rPr>
+        <w:t xml:space="preserve">: Es una operación, algoritmo, que lo que hace que sea de la misma llave vaya a al mismo nodo en base al </w:t>
+      </w:r>
+      <w:proofErr w:type="spellStart"/>
+      <w:r>
+        <w:rPr>
+          <w:lang w:val="es-EC"/>
+        </w:rPr>
+        <w:t>join</w:t>
+      </w:r>
+      <w:proofErr w:type="spellEnd"/>
+      <w:r>
+        <w:rPr>
+          <w:lang w:val="es-EC"/>
+        </w:rPr>
+        <w:t xml:space="preserve"> id como en este caso </w:t>
+      </w:r>
+      <w:proofErr w:type="spellStart"/>
+      <w:r>
+        <w:rPr>
+          <w:lang w:val="es-EC"/>
+        </w:rPr>
+        <w:t>producto_id</w:t>
+      </w:r>
+      <w:proofErr w:type="spellEnd"/>
+      <w:r>
+        <w:rPr>
+          <w:lang w:val="es-EC"/>
+        </w:rPr>
+        <w:t xml:space="preserve">. Esto se hace para las </w:t>
+      </w:r>
+      <w:proofErr w:type="spellStart"/>
+      <w:r>
+        <w:rPr>
+          <w:lang w:val="es-EC"/>
+        </w:rPr>
+        <w:t>tabals</w:t>
+      </w:r>
+      <w:proofErr w:type="spellEnd"/>
+      <w:r>
+        <w:rPr>
+          <w:lang w:val="es-EC"/>
+        </w:rPr>
+        <w:t xml:space="preserve"> del </w:t>
+      </w:r>
+      <w:proofErr w:type="spellStart"/>
+      <w:r>
+        <w:rPr>
+          <w:lang w:val="es-EC"/>
+        </w:rPr>
+        <w:t>join</w:t>
+      </w:r>
+      <w:proofErr w:type="spellEnd"/>
+      <w:r>
+        <w:rPr>
+          <w:lang w:val="es-EC"/>
+        </w:rPr>
+        <w:t>, es una operación costosa.</w:t>
+      </w:r>
+    </w:p>
+    <w:p>
+      <w:pPr>
+        <w:pStyle w:val="ListParagraph"/>
+        <w:numPr>
+          <w:ilvl w:val="0"/>
+          <w:numId w:val="1"/>
+        </w:numPr>
+        <w:rPr>
+          <w:lang w:val="es-EC"/>
+        </w:rPr>
+      </w:pPr>
+      <w:proofErr w:type="spellStart"/>
+      <w:r>
+        <w:rPr>
+          <w:lang w:val="es-EC"/>
+        </w:rPr>
+        <w:lastRenderedPageBreak/>
+        <w:t>Shuffle</w:t>
+      </w:r>
+      <w:proofErr w:type="spellEnd"/>
+      <w:r>
+        <w:rPr>
+          <w:lang w:val="es-EC"/>
+        </w:rPr>
+        <w:t xml:space="preserve">: Reordenar ya grupas todas las llaves Enel </w:t>
+      </w:r>
+      <w:proofErr w:type="spellStart"/>
+      <w:r>
+        <w:rPr>
+          <w:lang w:val="es-EC"/>
+        </w:rPr>
+        <w:t>ondo</w:t>
+      </w:r>
+      <w:proofErr w:type="spellEnd"/>
+      <w:r>
+        <w:rPr>
+          <w:lang w:val="es-EC"/>
+        </w:rPr>
+        <w:t xml:space="preserve"> de forma que cuando suceda el </w:t>
+      </w:r>
+      <w:proofErr w:type="spellStart"/>
+      <w:r>
+        <w:rPr>
+          <w:lang w:val="es-EC"/>
+        </w:rPr>
+        <w:t>join</w:t>
+      </w:r>
+      <w:proofErr w:type="spellEnd"/>
+      <w:r>
+        <w:rPr>
+          <w:lang w:val="es-EC"/>
+        </w:rPr>
+        <w:t xml:space="preserve"> se tenga todo ahí mismo. Se llama </w:t>
+      </w:r>
+      <w:proofErr w:type="spellStart"/>
+      <w:r>
+        <w:rPr>
+          <w:lang w:val="es-EC"/>
+        </w:rPr>
+        <w:t>Shuffle</w:t>
+      </w:r>
+      <w:proofErr w:type="spellEnd"/>
+      <w:r>
+        <w:rPr>
+          <w:lang w:val="es-EC"/>
+        </w:rPr>
+        <w:t xml:space="preserve"> </w:t>
+      </w:r>
+      <w:proofErr w:type="spellStart"/>
+      <w:r>
+        <w:rPr>
+          <w:lang w:val="es-EC"/>
+        </w:rPr>
+        <w:t>Map</w:t>
+      </w:r>
+      <w:proofErr w:type="spellEnd"/>
+      <w:r>
+        <w:rPr>
+          <w:lang w:val="es-EC"/>
+        </w:rPr>
+        <w:t>.</w:t>
+      </w:r>
+    </w:p>
+    <w:p>
+      <w:pPr>
+        <w:pStyle w:val="ListParagraph"/>
+        <w:numPr>
+          <w:ilvl w:val="0"/>
+          <w:numId w:val="1"/>
+        </w:numPr>
+        <w:rPr>
+          <w:lang w:val="es-EC"/>
+        </w:rPr>
+      </w:pPr>
+      <w:proofErr w:type="spellStart"/>
+      <w:r>
+        <w:rPr>
+          <w:lang w:val="es-EC"/>
+        </w:rPr>
+        <w:t>Reduccion</w:t>
+      </w:r>
+      <w:proofErr w:type="spellEnd"/>
+      <w:r>
+        <w:rPr>
+          <w:lang w:val="es-EC"/>
+        </w:rPr>
+        <w:t xml:space="preserve">: Cuando em data todo es la tabla que resume todo juntado, solo ocurre cuando haya una acción con un </w:t>
+      </w:r>
+      <w:proofErr w:type="gramStart"/>
+      <w:r>
+        <w:rPr>
+          <w:lang w:val="es-EC"/>
+        </w:rPr>
+        <w:t>show</w:t>
+      </w:r>
+      <w:proofErr w:type="gramEnd"/>
+      <w:r>
+        <w:rPr>
+          <w:lang w:val="es-EC"/>
+        </w:rPr>
+        <w:t xml:space="preserve">, sino todo esta </w:t>
+      </w:r>
+      <w:proofErr w:type="spellStart"/>
+      <w:r>
+        <w:rPr>
+          <w:lang w:val="es-EC"/>
+        </w:rPr>
+        <w:t>distrbuido</w:t>
+      </w:r>
+      <w:proofErr w:type="spellEnd"/>
+      <w:r>
+        <w:rPr>
+          <w:lang w:val="es-EC"/>
+        </w:rPr>
+        <w:t>.</w:t>
+      </w:r>
+    </w:p>
+    <w:p>
+      <w:pPr>
+        <w:rPr>
+          <w:lang w:val="es-EC"/>
+        </w:rPr>
+      </w:pPr>
+      <w:r>
+        <w:rPr>
+          <w:lang w:val="es-EC"/>
+        </w:rPr>
+        <w:t>Hay dos tipos de JOIN:</w:t>
+      </w:r>
+      <w:r>
+        <w:rPr>
+          <w:lang w:val="es-EC"/>
+        </w:rPr>
+        <w:br/>
+        <w:t xml:space="preserve">- </w:t>
+      </w:r>
+      <w:proofErr w:type="spellStart"/>
+      <w:r>
+        <w:rPr>
+          <w:lang w:val="es-EC"/>
+        </w:rPr>
+        <w:t>Join</w:t>
+      </w:r>
+      <w:proofErr w:type="spellEnd"/>
+      <w:r>
+        <w:rPr>
+          <w:lang w:val="es-EC"/>
+        </w:rPr>
+        <w:t xml:space="preserve"> Normal: Lo que vimos antes, ambas tablas se </w:t>
+      </w:r>
+      <w:proofErr w:type="spellStart"/>
+      <w:r>
+        <w:rPr>
+          <w:lang w:val="es-EC"/>
+        </w:rPr>
+        <w:t>reparticionan</w:t>
+      </w:r>
+      <w:proofErr w:type="spellEnd"/>
+      <w:r>
+        <w:rPr>
+          <w:lang w:val="es-EC"/>
+        </w:rPr>
+        <w:t xml:space="preserve"> con las llaves juntas. Es recomendable cuando ambas tablas son grandes e iguales casi entre </w:t>
+      </w:r>
+      <w:proofErr w:type="spellStart"/>
+      <w:r>
+        <w:rPr>
+          <w:lang w:val="es-EC"/>
+        </w:rPr>
+        <w:t>si</w:t>
+      </w:r>
+      <w:proofErr w:type="spellEnd"/>
+      <w:r>
+        <w:rPr>
+          <w:lang w:val="es-EC"/>
+        </w:rPr>
+        <w:t>.</w:t>
+      </w:r>
+    </w:p>
+    <w:p>
+      <w:pPr>
+        <w:rPr>
+          <w:lang w:val="es-EC"/>
+        </w:rPr>
+      </w:pPr>
+      <w:r>
+        <w:rPr>
+          <w:lang w:val="es-EC"/>
+        </w:rPr>
+        <w:t xml:space="preserve">Broadcast </w:t>
+      </w:r>
+      <w:proofErr w:type="spellStart"/>
+      <w:r>
+        <w:rPr>
+          <w:lang w:val="es-EC"/>
+        </w:rPr>
+        <w:t>Join</w:t>
+      </w:r>
+      <w:proofErr w:type="spellEnd"/>
+      <w:r>
+        <w:rPr>
+          <w:lang w:val="es-EC"/>
+        </w:rPr>
+        <w:t xml:space="preserve">: Es igual pero replica la 1 GB de </w:t>
+      </w:r>
+      <w:proofErr w:type="spellStart"/>
+      <w:r>
+        <w:rPr>
+          <w:lang w:val="es-EC"/>
+        </w:rPr>
+        <w:t>latabla</w:t>
+      </w:r>
+      <w:proofErr w:type="spellEnd"/>
+      <w:r>
+        <w:rPr>
+          <w:lang w:val="es-EC"/>
+        </w:rPr>
+        <w:t xml:space="preserve"> </w:t>
+      </w:r>
+      <w:proofErr w:type="spellStart"/>
+      <w:proofErr w:type="gramStart"/>
+      <w:r>
+        <w:rPr>
+          <w:lang w:val="es-EC"/>
+        </w:rPr>
+        <w:t>peque;a</w:t>
+      </w:r>
+      <w:proofErr w:type="spellEnd"/>
+      <w:proofErr w:type="gramEnd"/>
+      <w:r>
+        <w:rPr>
+          <w:lang w:val="es-EC"/>
+        </w:rPr>
+        <w:t xml:space="preserve"> en cada nodo, se ahora buscar en esto. Se recomienda con tablas </w:t>
+      </w:r>
+      <w:proofErr w:type="spellStart"/>
+      <w:r>
+        <w:rPr>
+          <w:lang w:val="es-EC"/>
+        </w:rPr>
+        <w:t>dimenisonales</w:t>
+      </w:r>
+      <w:proofErr w:type="spellEnd"/>
+      <w:r>
+        <w:rPr>
+          <w:lang w:val="es-EC"/>
+        </w:rPr>
+        <w:t xml:space="preserve"> pequeñas, como por ejemplo 100 MB pero depende del nodo.</w:t>
+      </w:r>
+    </w:p>
+    <w:p>
+      <w:pPr>
+        <w:rPr>
+          <w:lang w:val="es-EC"/>
+        </w:rPr>
+      </w:pPr>
+      <w:r>
+        <w:rPr>
+          <w:lang w:val="es-EC"/>
+        </w:rPr>
+        <w:t xml:space="preserve">Se hace </w:t>
+      </w:r>
+      <w:proofErr w:type="spellStart"/>
+      <w:r>
+        <w:rPr>
+          <w:lang w:val="es-EC"/>
+        </w:rPr>
+        <w:t>shiffle</w:t>
+      </w:r>
+      <w:proofErr w:type="spellEnd"/>
+      <w:r>
+        <w:rPr>
+          <w:lang w:val="es-EC"/>
+        </w:rPr>
+        <w:t xml:space="preserve"> de una sola tabla. </w:t>
+      </w:r>
+    </w:p>
+    <w:p>
+      <w:pPr>
+        <w:rPr>
+          <w:lang w:val="es-EC"/>
+        </w:rPr>
+      </w:pPr>
+      <w:r>
+        <w:rPr>
+          <w:lang w:val="es-EC"/>
+        </w:rPr>
+        <w:t xml:space="preserve">Esto no </w:t>
+      </w:r>
+      <w:proofErr w:type="spellStart"/>
+      <w:r>
+        <w:rPr>
+          <w:lang w:val="es-EC"/>
+        </w:rPr>
+        <w:t>e</w:t>
+      </w:r>
+      <w:proofErr w:type="spellEnd"/>
+      <w:r>
+        <w:rPr>
+          <w:lang w:val="es-EC"/>
+        </w:rPr>
+        <w:t xml:space="preserve"> </w:t>
+      </w:r>
+      <w:proofErr w:type="spellStart"/>
+      <w:r>
+        <w:rPr>
+          <w:lang w:val="es-EC"/>
+        </w:rPr>
+        <w:t>sun</w:t>
+      </w:r>
+      <w:proofErr w:type="spellEnd"/>
+      <w:r>
+        <w:rPr>
+          <w:lang w:val="es-EC"/>
+        </w:rPr>
+        <w:t xml:space="preserve"> </w:t>
+      </w:r>
+      <w:proofErr w:type="spellStart"/>
+      <w:r>
+        <w:rPr>
+          <w:lang w:val="es-EC"/>
+        </w:rPr>
+        <w:t>warehouse</w:t>
+      </w:r>
+      <w:proofErr w:type="spellEnd"/>
+      <w:r>
+        <w:rPr>
+          <w:lang w:val="es-EC"/>
+        </w:rPr>
+        <w:t xml:space="preserve"> e</w:t>
+      </w:r>
+      <w:r>
+        <w:rPr>
+          <w:lang w:val="es-EC"/>
+        </w:rPr>
+        <w:t xml:space="preserve">s un motor de procesamiento, todo se </w:t>
+      </w:r>
+      <w:proofErr w:type="spellStart"/>
+      <w:r>
+        <w:rPr>
+          <w:lang w:val="es-EC"/>
+        </w:rPr>
+        <w:t>gaurda</w:t>
+      </w:r>
+      <w:proofErr w:type="spellEnd"/>
+      <w:r>
+        <w:rPr>
+          <w:lang w:val="es-EC"/>
+        </w:rPr>
+        <w:t xml:space="preserve"> nativamente en raw en el volumen del directorio.</w:t>
+      </w:r>
+    </w:p>
+    <w:p>
+      <w:pPr>
+        <w:rPr>
+          <w:lang w:val="es-EC"/>
+        </w:rPr>
+      </w:pPr>
+      <w:proofErr w:type="spellStart"/>
+      <w:r>
+        <w:rPr>
+          <w:lang w:val="es-EC"/>
+        </w:rPr>
+        <w:t>Postrgess</w:t>
+      </w:r>
+      <w:proofErr w:type="spellEnd"/>
+      <w:r>
+        <w:rPr>
+          <w:lang w:val="es-EC"/>
+        </w:rPr>
+        <w:t xml:space="preserve"> es solo un motor de base de </w:t>
+      </w:r>
+      <w:proofErr w:type="spellStart"/>
+      <w:r>
+        <w:rPr>
+          <w:lang w:val="es-EC"/>
+        </w:rPr>
+        <w:t>atos</w:t>
+      </w:r>
+      <w:proofErr w:type="spellEnd"/>
+      <w:r>
+        <w:rPr>
+          <w:lang w:val="es-EC"/>
+        </w:rPr>
+        <w:t xml:space="preserve">, </w:t>
+      </w:r>
+      <w:proofErr w:type="spellStart"/>
+      <w:r>
+        <w:rPr>
+          <w:lang w:val="es-EC"/>
+        </w:rPr>
+        <w:t>spark</w:t>
+      </w:r>
+      <w:proofErr w:type="spellEnd"/>
+      <w:r>
+        <w:rPr>
+          <w:lang w:val="es-EC"/>
+        </w:rPr>
+        <w:t xml:space="preserve"> es un motor de procesamiento </w:t>
+      </w:r>
+      <w:proofErr w:type="spellStart"/>
+      <w:r>
+        <w:rPr>
+          <w:lang w:val="es-EC"/>
+        </w:rPr>
+        <w:t>disitrbuido</w:t>
+      </w:r>
+      <w:proofErr w:type="spellEnd"/>
+      <w:r>
+        <w:rPr>
+          <w:lang w:val="es-EC"/>
+        </w:rPr>
+        <w:t xml:space="preserve">. Por eso se integra a un data </w:t>
+      </w:r>
+      <w:proofErr w:type="spellStart"/>
+      <w:r>
+        <w:rPr>
+          <w:lang w:val="es-EC"/>
+        </w:rPr>
+        <w:t>lake</w:t>
+      </w:r>
+      <w:proofErr w:type="spellEnd"/>
+      <w:r>
+        <w:rPr>
+          <w:lang w:val="es-EC"/>
+        </w:rPr>
+        <w:t xml:space="preserve"> y se procesa en </w:t>
+      </w:r>
+      <w:proofErr w:type="spellStart"/>
+      <w:r>
+        <w:rPr>
+          <w:lang w:val="es-EC"/>
+        </w:rPr>
+        <w:t>spark</w:t>
+      </w:r>
+      <w:proofErr w:type="spellEnd"/>
+      <w:r>
+        <w:rPr>
+          <w:lang w:val="es-EC"/>
+        </w:rPr>
+        <w:t>.</w:t>
+      </w:r>
+    </w:p>
+    <w:p>
+      <w:pPr>
+        <w:rPr>
+          <w:lang w:val="es-EC"/>
+        </w:rPr>
+      </w:pPr>
+      <w:r>
+        <w:rPr>
+          <w:lang w:val="es-EC"/>
+        </w:rPr>
+        <w:t xml:space="preserve">Revisar como se </w:t>
+      </w:r>
+      <w:proofErr w:type="spellStart"/>
+      <w:r>
+        <w:rPr>
+          <w:lang w:val="es-EC"/>
+        </w:rPr>
+        <w:t>partciiona</w:t>
+      </w:r>
+      <w:proofErr w:type="spellEnd"/>
+      <w:r>
+        <w:rPr>
+          <w:lang w:val="es-EC"/>
+        </w:rPr>
+        <w:t xml:space="preserve"> y que </w:t>
+      </w:r>
+      <w:proofErr w:type="spellStart"/>
+      <w:r>
+        <w:rPr>
+          <w:lang w:val="es-EC"/>
+        </w:rPr>
+        <w:t>apsa</w:t>
+      </w:r>
+      <w:proofErr w:type="spellEnd"/>
+      <w:r>
+        <w:rPr>
+          <w:lang w:val="es-EC"/>
+        </w:rPr>
+        <w:t xml:space="preserve"> en localhost 4040</w:t>
+      </w:r>
+    </w:p>
+    <w:p>
+      <w:pPr>
+        <w:rPr>
+          <w:lang w:val="es-EC"/>
+        </w:rPr>
+      </w:pPr>
+      <w:r>
+        <w:rPr>
+          <w:lang w:val="es-EC"/>
+        </w:rPr>
+        <w:t xml:space="preserve">Entender </w:t>
+      </w:r>
+      <w:proofErr w:type="spellStart"/>
+      <w:r>
+        <w:rPr>
+          <w:lang w:val="es-EC"/>
+        </w:rPr>
+        <w:t>por que</w:t>
+      </w:r>
+      <w:proofErr w:type="spellEnd"/>
+      <w:r>
+        <w:rPr>
+          <w:lang w:val="es-EC"/>
+        </w:rPr>
+        <w:t xml:space="preserve"> </w:t>
+      </w:r>
+      <w:proofErr w:type="spellStart"/>
+      <w:r>
+        <w:rPr>
+          <w:lang w:val="es-EC"/>
+        </w:rPr>
+        <w:t>relllama</w:t>
+      </w:r>
+      <w:proofErr w:type="spellEnd"/>
+      <w:r>
+        <w:rPr>
+          <w:lang w:val="es-EC"/>
+        </w:rPr>
+        <w:t xml:space="preserve"> como </w:t>
+      </w:r>
+      <w:proofErr w:type="spellStart"/>
+      <w:r>
+        <w:rPr>
+          <w:lang w:val="es-EC"/>
+        </w:rPr>
+        <w:t>ShulffleRowRDD</w:t>
+      </w:r>
+      <w:proofErr w:type="spellEnd"/>
+      <w:r>
+        <w:rPr>
+          <w:lang w:val="es-EC"/>
+        </w:rPr>
+        <w:t xml:space="preserve"> y por que es RDD que es y que api usa. </w:t>
+      </w:r>
     </w:p>
     <w:sectPr>
       <w:pgSz w:w="12240" w:h="15840"/>
@@ -11244,9 +12316,9 @@
     </w:lvl>
   </w:abstractNum>
   <w:abstractNum w:abstractNumId="9" w15:restartNumberingAfterBreak="0">
-    <w:nsid w:val="3EBE52CE"/>
+    <w:nsid w:val="3BA73D17"/>
     <w:multiLevelType w:val="hybridMultilevel"/>
-    <w:tmpl w:val="5532DCA6"/>
+    <w:tmpl w:val="3C74AF66"/>
     <w:lvl w:ilvl="0" w:tplc="0409000F">
       <w:start w:val="1"/>
       <w:numFmt w:val="decimal"/>
@@ -11333,6 +12405,95 @@
     </w:lvl>
   </w:abstractNum>
   <w:abstractNum w:abstractNumId="10" w15:restartNumberingAfterBreak="0">
+    <w:nsid w:val="3EBE52CE"/>
+    <w:multiLevelType w:val="hybridMultilevel"/>
+    <w:tmpl w:val="5532DCA6"/>
+    <w:lvl w:ilvl="0" w:tplc="0409000F">
+      <w:start w:val="1"/>
+      <w:numFmt w:val="decimal"/>
+      <w:lvlText w:val="%1."/>
+      <w:lvlJc w:val="left"/>
+      <w:pPr>
+        <w:ind w:left="720" w:hanging="360"/>
+      </w:pPr>
+      <w:rPr>
+        <w:rFonts w:hint="default"/>
+      </w:rPr>
+    </w:lvl>
+    <w:lvl w:ilvl="1" w:tplc="04090019" w:tentative="1">
+      <w:start w:val="1"/>
+      <w:numFmt w:val="lowerLetter"/>
+      <w:lvlText w:val="%2."/>
+      <w:lvlJc w:val="left"/>
+      <w:pPr>
+        <w:ind w:left="1440" w:hanging="360"/>
+      </w:pPr>
+    </w:lvl>
+    <w:lvl w:ilvl="2" w:tplc="0409001B" w:tentative="1">
+      <w:start w:val="1"/>
+      <w:numFmt w:val="lowerRoman"/>
+      <w:lvlText w:val="%3."/>
+      <w:lvlJc w:val="right"/>
+      <w:pPr>
+        <w:ind w:left="2160" w:hanging="180"/>
+      </w:pPr>
+    </w:lvl>
+    <w:lvl w:ilvl="3" w:tplc="0409000F" w:tentative="1">
+      <w:start w:val="1"/>
+      <w:numFmt w:val="decimal"/>
+      <w:lvlText w:val="%4."/>
+      <w:lvlJc w:val="left"/>
+      <w:pPr>
+        <w:ind w:left="2880" w:hanging="360"/>
+      </w:pPr>
+    </w:lvl>
+    <w:lvl w:ilvl="4" w:tplc="04090019" w:tentative="1">
+      <w:start w:val="1"/>
+      <w:numFmt w:val="lowerLetter"/>
+      <w:lvlText w:val="%5."/>
+      <w:lvlJc w:val="left"/>
+      <w:pPr>
+        <w:ind w:left="3600" w:hanging="360"/>
+      </w:pPr>
+    </w:lvl>
+    <w:lvl w:ilvl="5" w:tplc="0409001B" w:tentative="1">
+      <w:start w:val="1"/>
+      <w:numFmt w:val="lowerRoman"/>
+      <w:lvlText w:val="%6."/>
+      <w:lvlJc w:val="right"/>
+      <w:pPr>
+        <w:ind w:left="4320" w:hanging="180"/>
+      </w:pPr>
+    </w:lvl>
+    <w:lvl w:ilvl="6" w:tplc="0409000F" w:tentative="1">
+      <w:start w:val="1"/>
+      <w:numFmt w:val="decimal"/>
+      <w:lvlText w:val="%7."/>
+      <w:lvlJc w:val="left"/>
+      <w:pPr>
+        <w:ind w:left="5040" w:hanging="360"/>
+      </w:pPr>
+    </w:lvl>
+    <w:lvl w:ilvl="7" w:tplc="04090019" w:tentative="1">
+      <w:start w:val="1"/>
+      <w:numFmt w:val="lowerLetter"/>
+      <w:lvlText w:val="%8."/>
+      <w:lvlJc w:val="left"/>
+      <w:pPr>
+        <w:ind w:left="5760" w:hanging="360"/>
+      </w:pPr>
+    </w:lvl>
+    <w:lvl w:ilvl="8" w:tplc="0409001B" w:tentative="1">
+      <w:start w:val="1"/>
+      <w:numFmt w:val="lowerRoman"/>
+      <w:lvlText w:val="%9."/>
+      <w:lvlJc w:val="right"/>
+      <w:pPr>
+        <w:ind w:left="6480" w:hanging="180"/>
+      </w:pPr>
+    </w:lvl>
+  </w:abstractNum>
+  <w:abstractNum w:abstractNumId="11" w15:restartNumberingAfterBreak="0">
     <w:nsid w:val="44BE7D2D"/>
     <w:multiLevelType w:val="hybridMultilevel"/>
     <w:tmpl w:val="4678D16E"/>
@@ -11421,7 +12582,7 @@
       </w:pPr>
     </w:lvl>
   </w:abstractNum>
-  <w:abstractNum w:abstractNumId="11" w15:restartNumberingAfterBreak="0">
+  <w:abstractNum w:abstractNumId="12" w15:restartNumberingAfterBreak="0">
     <w:nsid w:val="461F61B3"/>
     <w:multiLevelType w:val="hybridMultilevel"/>
     <w:tmpl w:val="4DD09E8A"/>
@@ -11510,7 +12671,7 @@
       </w:pPr>
     </w:lvl>
   </w:abstractNum>
-  <w:abstractNum w:abstractNumId="12" w15:restartNumberingAfterBreak="0">
+  <w:abstractNum w:abstractNumId="13" w15:restartNumberingAfterBreak="0">
     <w:nsid w:val="5C3A66CD"/>
     <w:multiLevelType w:val="hybridMultilevel"/>
     <w:tmpl w:val="D4DA37F4"/>
@@ -11599,7 +12760,7 @@
       </w:pPr>
     </w:lvl>
   </w:abstractNum>
-  <w:abstractNum w:abstractNumId="13" w15:restartNumberingAfterBreak="0">
+  <w:abstractNum w:abstractNumId="14" w15:restartNumberingAfterBreak="0">
     <w:nsid w:val="72CC5D15"/>
     <w:multiLevelType w:val="hybridMultilevel"/>
     <w:tmpl w:val="056A2704"/>
@@ -11692,7 +12853,7 @@
     <w:abstractNumId w:val="7"/>
   </w:num>
   <w:num w:numId="2" w16cid:durableId="384766467">
-    <w:abstractNumId w:val="9"/>
+    <w:abstractNumId w:val="10"/>
   </w:num>
   <w:num w:numId="3" w16cid:durableId="1490294888">
     <w:abstractNumId w:val="8"/>
@@ -11701,19 +12862,19 @@
     <w:abstractNumId w:val="6"/>
   </w:num>
   <w:num w:numId="5" w16cid:durableId="1406996107">
-    <w:abstractNumId w:val="10"/>
+    <w:abstractNumId w:val="11"/>
   </w:num>
   <w:num w:numId="6" w16cid:durableId="1595551792">
     <w:abstractNumId w:val="2"/>
   </w:num>
   <w:num w:numId="7" w16cid:durableId="281616495">
+    <w:abstractNumId w:val="13"/>
+  </w:num>
+  <w:num w:numId="8" w16cid:durableId="1870798660">
     <w:abstractNumId w:val="12"/>
   </w:num>
-  <w:num w:numId="8" w16cid:durableId="1870798660">
-    <w:abstractNumId w:val="11"/>
-  </w:num>
   <w:num w:numId="9" w16cid:durableId="1170216123">
-    <w:abstractNumId w:val="13"/>
+    <w:abstractNumId w:val="14"/>
   </w:num>
   <w:num w:numId="10" w16cid:durableId="805005114">
     <w:abstractNumId w:val="5"/>
@@ -11729,6 +12890,9 @@
   </w:num>
   <w:num w:numId="14" w16cid:durableId="1236403872">
     <w:abstractNumId w:val="3"/>
+  </w:num>
+  <w:num w:numId="15" w16cid:durableId="195967233">
+    <w:abstractNumId w:val="9"/>
   </w:num>
 </w:numbering>
 </file>

</xml_diff>